<commit_message>
pushing things to github
</commit_message>
<xml_diff>
--- a/figures/tableS4.docx
+++ b/figures/tableS4.docx
@@ -1254,7 +1254,7 @@
                 <w:szCs w:val="22"/>
                 <w:color w:val="000000"/>
               </w:rPr>
-              <w:t xml:space="preserve">-34.8</w:t>
+              <w:t xml:space="preserve">-32.2</w:t>
             </w:r>
           </w:p>
         </w:tc>
@@ -1364,7 +1364,7 @@
                 <w:szCs w:val="22"/>
                 <w:color w:val="000000"/>
               </w:rPr>
-              <w:t xml:space="preserve">-33.6</w:t>
+              <w:t xml:space="preserve">-34.0</w:t>
             </w:r>
           </w:p>
         </w:tc>

</xml_diff>